<commit_message>
icr_paper: regenerate results and submission files
Co-Authored-By: Tatsuki Onishi <bougtoir@gmail.com>
</commit_message>
<xml_diff>
--- a/icr_paper/LINKO_manuscript_english.docx
+++ b/icr_paper/LINKO_manuscript_english.docx
@@ -514,7 +514,7 @@
           <w:rFonts w:ascii="Times New Roman" w:hAnsi="Times New Roman"/>
           <w:i w:val="0"/>
         </w:rPr>
-        <w:t>. Aims: to determine whether dispersion in ICR across studies is associated with, or causes, statistical heterogeneity, and to determine how sensitive the estimators are to variable counting. Data-generating mechanism: for each study, D correlated standard normal variables were generated per arm with an exchangeable-like correlation structure, n = 200 participants per arm, a treatment effect of 0.5 standard deviations on the endpoint and a spillover fraction of 0.3 applied to non-endpoint variables. Estimands: the pooled endpoint effect and the heterogeneity statistics. Methods: DerSimonian-Laird random-effects meta-analysis of 10 studies. Performance measures: mean I-squared, mean tau-squared, bias of the pooled effect, and the paired difference in I-squared between scenarios, each with its Monte Carlo standard error over 1000 repetitions.</w:t>
+        <w:t>. Aims: to determine whether dispersion in ICR across studies is associated with, or causes, statistical heterogeneity, and to determine how sensitive the estimators are to variable counting. Data-generating mechanism: for each study, D correlated standard normal variables were generated per arm with an exchangeable-like correlation structure, n = 200 participants per study split equally between the two arms, a treatment effect of 0.5 standard deviations on the endpoint and a spillover fraction of 0.3 applied to non-endpoint variables. Estimands: the pooled endpoint effect and the heterogeneity statistics. Methods: DerSimonian-Laird random-effects meta-analysis of 10 studies. Performance measures: mean I-squared, mean tau-squared, bias of the pooled effect, and the paired difference in I-squared between scenarios, each with its Monte Carlo standard error over 1000 repetitions.</w:t>
       </w:r>
     </w:p>
     <w:p>
@@ -999,7 +999,7 @@
           <w:rFonts w:ascii="Times New Roman" w:hAnsi="Times New Roman"/>
           <w:i w:val="0"/>
         </w:rPr>
-        <w:t>The International Stroke Trial data are openly available from the University of Edinburgh DataShare repository at https://datashare.ed.ac.uk/handle/10283/124 and are downloaded by the script provided with the analysis code. The baseline and effect data extracted from the published statin and glucose-control trials, with their per-study citations, are included in the code repository. All analysis code, the generated results files and the manuscript build script are available at https://github.com/bougtoir/linko-icr-paper. Every number in this article is regenerated from those sources by a single command; the results files record the software versions and the commit used (commit 6689548cb6f3).</w:t>
+        <w:t>The International Stroke Trial data are openly available from the University of Edinburgh DataShare repository at https://datashare.ed.ac.uk/handle/10283/124 and are downloaded by the script provided with the analysis code. The baseline and effect data extracted from the published statin and glucose-control trials, with their per-study citations, are included in the code repository. All analysis code, the generated results files and the manuscript build script are available at https://github.com/bougtoir/linko-icr-paper. Every number in this article is regenerated from those sources by a single command; the results files record the software versions and the commit used (commit 9ba7d28ff1d1).</w:t>
       </w:r>
     </w:p>
     <w:p>

</xml_diff>

<commit_message>
icr_paper: sync threshold/sample-size fixes and regenerated outputs
Co-Authored-By: Tatsuki Onishi <bougtoir@gmail.com>
</commit_message>
<xml_diff>
--- a/icr_paper/LINKO_manuscript_english.docx
+++ b/icr_paper/LINKO_manuscript_english.docx
@@ -514,7 +514,7 @@
           <w:rFonts w:ascii="Times New Roman" w:hAnsi="Times New Roman"/>
           <w:i w:val="0"/>
         </w:rPr>
-        <w:t>. Aims: to determine whether dispersion in ICR across studies is associated with, or causes, statistical heterogeneity, and to determine how sensitive the estimators are to variable counting. Data-generating mechanism: for each study, D correlated standard normal variables were generated per arm with an exchangeable-like correlation structure, n = 200 participants per arm, a treatment effect of 0.5 standard deviations on the endpoint and a spillover fraction of 0.3 applied to non-endpoint variables. Estimands: the pooled endpoint effect and the heterogeneity statistics. Methods: DerSimonian-Laird random-effects meta-analysis of 10 studies. Performance measures: mean I-squared, mean tau-squared, bias of the pooled effect, and the paired difference in I-squared between scenarios, each with its Monte Carlo standard error over 1000 repetitions.</w:t>
+        <w:t>. Aims: to determine whether dispersion in ICR across studies is associated with, or causes, statistical heterogeneity, and to determine how sensitive the estimators are to variable counting. Data-generating mechanism: for each study, D correlated standard normal variables were generated per arm with an exchangeable-like correlation structure, n = 200 participants per study split equally between the two arms, a treatment effect of 0.5 standard deviations on the endpoint and a spillover fraction of 0.3 applied to non-endpoint variables. Estimands: the pooled endpoint effect and the heterogeneity statistics. Methods: DerSimonian-Laird random-effects meta-analysis of 10 studies. Performance measures: mean I-squared, mean tau-squared, bias of the pooled effect, and the paired difference in I-squared between scenarios, each with its Monte Carlo standard error over 1000 repetitions.</w:t>
       </w:r>
     </w:p>
     <w:p>
@@ -999,7 +999,7 @@
           <w:rFonts w:ascii="Times New Roman" w:hAnsi="Times New Roman"/>
           <w:i w:val="0"/>
         </w:rPr>
-        <w:t>The International Stroke Trial data are openly available from the University of Edinburgh DataShare repository at https://datashare.ed.ac.uk/handle/10283/124 and are downloaded by the script provided with the analysis code. The baseline and effect data extracted from the published statin and glucose-control trials, with their per-study citations, are included in the code repository. All analysis code, the generated results files and the manuscript build script are available at https://github.com/bougtoir/linko-icr-paper. Every number in this article is regenerated from those sources by a single command; the results files record the software versions and the commit used (commit 6689548cb6f3).</w:t>
+        <w:t>The International Stroke Trial data are openly available from the University of Edinburgh DataShare repository at https://datashare.ed.ac.uk/handle/10283/124 and are downloaded by the script provided with the analysis code. The baseline and effect data extracted from the published statin and glucose-control trials, with their per-study citations, are included in the code repository. All analysis code, the generated results files and the manuscript build script are available at https://github.com/bougtoir/linko-icr-paper. Every number in this article is regenerated from those sources by a single command; the results files record the software versions and the commit used (commit 9ba7d28ff1d1).</w:t>
       </w:r>
     </w:p>
     <w:p>

</xml_diff>

<commit_message>
Consolidate figures/tables: move glucose-control prism and LOO to supplementary
Co-Authored-By: Tatsuki Onishi <bougtoir@gmail.com>
</commit_message>
<xml_diff>
--- a/icr_paper/LINKO_manuscript_english.docx
+++ b/icr_paper/LINKO_manuscript_english.docx
@@ -766,7 +766,7 @@
           <w:rFonts w:ascii="Times New Roman" w:hAnsi="Times New Roman"/>
           <w:i w:val="0"/>
         </w:rPr>
-        <w:t>Figure 3 and Figure 4 show the two collections as prism forest plots, in which the structural difference between the collections is visible alongside the effect estimates.</w:t>
+        <w:t>Figure 3 shows the statin collection as a prism forest plot, in which ICR_std is visible alongside the effect estimates. The same display for the intensive glucose-control collection is given in Supplementary Figure S1.</w:t>
       </w:r>
     </w:p>
     <w:p>
@@ -786,7 +786,7 @@
           <w:rFonts w:ascii="Times New Roman" w:hAnsi="Times New Roman"/>
           <w:i w:val="0"/>
         </w:rPr>
-        <w:t>Across the 8 IST country groups, the loading-based estimator ranged from 0.046 to 0.180 (coefficient of variation 0.36) and the regression-based estimator from 0.00073 to 0.00230 (coefficient of variation 0.33), while ICR_std was identical at 0.040 by construction (Table 6, Figure 5). The regression-based estimator was associated with 14-day mortality (r = 0.896, P = 0.003); the loading-based estimator was not (r = 0.265, P = 0.526). In leave-one-out recomputation the regression-based association ranged from r = 0.843 to 0.954 (P from &lt; 0.001 to 0.017) and the loading-based association from r = 0.154 to 0.526 (Table 7, Figure 6).</w:t>
+        <w:t>Across the 8 IST country groups, the loading-based estimator ranged from 0.046 to 0.180 (coefficient of variation 0.36) and the regression-based estimator from 0.00073 to 0.00230 (coefficient of variation 0.33), while ICR_std was identical at 0.040 by construction (Table 6, Figure 4). The regression-based estimator was associated with 14-day mortality (r = 0.896, P = 0.003); the loading-based estimator was not (r = 0.265, P = 0.526). In leave-one-out recomputation the regression-based association ranged from r = 0.843 to 0.954 (P from &lt; 0.001 to 0.017) and the loading-based association from r = 0.154 to 0.526 (Supplementary Table S1, Supplementary Figure S2).</w:t>
       </w:r>
     </w:p>
     <w:p>
@@ -813,7 +813,7 @@
           <w:rFonts w:ascii="Times New Roman" w:hAnsi="Times New Roman"/>
           <w:i w:val="0"/>
         </w:rPr>
-        <w:t>Figure 7 displays the same groups as a prism forest plot, with both PCA-based estimators encoded simultaneously.</w:t>
+        <w:t>Figure 5 displays the same groups as a prism forest plot, with both PCA-based estimators encoded simultaneously.</w:t>
       </w:r>
     </w:p>
     <w:p>
@@ -833,7 +833,7 @@
           <w:rFonts w:ascii="Times New Roman" w:hAnsi="Times New Roman"/>
           <w:i w:val="0"/>
         </w:rPr>
-        <w:t>Ordering studies by proximity to the median ICR did not reach a conclusive pooled estimate with fewer studies than random ordering: the mean number of studies required was 3.94 for random ordering, 3.91 for ICR-matched ordering and 4.00 for ICR-median ordering (Table 8). We report this negative result because ICR-guided prioritisation is an obvious application of the measure and, on this evidence, it is not supported.</w:t>
+        <w:t>Ordering studies by proximity to the median ICR did not reach a conclusive pooled estimate with fewer studies than random ordering: the mean number of studies required was 3.94 for random ordering, 3.91 for ICR-matched ordering and 4.00 for ICR-median ordering (Table 7). We report this negative result because ICR-guided prioritisation is an obvious application of the measure and, on this evidence, it is not supported.</w:t>
       </w:r>
     </w:p>
     <w:p>
@@ -5904,7 +5904,7 @@
           <w:b/>
           <w:sz w:val="20"/>
         </w:rPr>
-        <w:t>Table 7. Leave-one-out recomputation of the association between the PCA-based ICR estimators and 14-day mortality across the International Stroke Trial country groups.</w:t>
+        <w:t>Supplementary Table S1. Leave-one-out recomputation of the association between the PCA-based ICR estimators and 14-day mortality across the International Stroke Trial country groups.</w:t>
       </w:r>
     </w:p>
     <w:tbl>
@@ -6863,7 +6863,7 @@
           <w:b/>
           <w:sz w:val="20"/>
         </w:rPr>
-        <w:t>Table 8. Number of studies required before the pooled estimate excluded the null, by ordering strategy (500 repetitions of 15 simulated studies).</w:t>
+        <w:t>Table 7. Number of studies required before the pooled estimate excluded the null, by ordering strategy (500 repetitions of 15 simulated studies).</w:t>
       </w:r>
     </w:p>
     <w:tbl>
@@ -7304,7 +7304,7 @@
           <w:rFonts w:ascii="Times New Roman" w:hAnsi="Times New Roman"/>
           <w:i w:val="0"/>
         </w:rPr>
-        <w:t>Figure 4. Prism forest plot for the intensive glucose-control collection.</w:t>
+        <w:t>Supplementary Figure S1. Prism forest plot for the intensive glucose-control collection.</w:t>
       </w:r>
     </w:p>
     <w:p>
@@ -7313,7 +7313,7 @@
           <w:rFonts w:ascii="Times New Roman" w:hAnsi="Times New Roman"/>
           <w:i w:val="0"/>
         </w:rPr>
-        <w:t>Figure 5. Principal-component-based ICR in eight International Stroke Trial country groups: estimator values, their dispersion, and their relation to 14-day mortality.</w:t>
+        <w:t>Figure 4. Principal-component-based ICR in eight International Stroke Trial country groups: estimator values, their dispersion, and their relation to 14-day mortality.</w:t>
       </w:r>
     </w:p>
     <w:p>
@@ -7322,7 +7322,7 @@
           <w:rFonts w:ascii="Times New Roman" w:hAnsi="Times New Roman"/>
           <w:i w:val="0"/>
         </w:rPr>
-        <w:t>Figure 6. Leave-one-out recomputation of the association between each PCA-based ICR estimator and 14-day mortality across the eight country groups.</w:t>
+        <w:t>Supplementary Figure S2. Leave-one-out recomputation of the association between each PCA-based ICR estimator and 14-day mortality across the eight country groups.</w:t>
       </w:r>
     </w:p>
     <w:p>
@@ -7331,7 +7331,7 @@
           <w:rFonts w:ascii="Times New Roman" w:hAnsi="Times New Roman"/>
           <w:i w:val="0"/>
         </w:rPr>
-        <w:t>Figure 7. Prism forest plot for the International Stroke Trial country groups, with colour encoding the loading-based estimator and marker size the regression-based estimator. Rates are shown for display; the groups are not independent trials.</w:t>
+        <w:t>Figure 5. Prism forest plot for the International Stroke Trial country groups, with colour encoding the loading-based estimator and marker size the regression-based estimator. Rates are shown for display; the groups are not independent trials.</w:t>
       </w:r>
     </w:p>
     <w:sectPr>

</xml_diff>